<commit_message>
ch160: humanize the Word report prose
Same voice pass on capstone-1-coffee-fill-weight.docx (hand-authored memo):
- 'money left on the table at volume' -> 'At the volumes we run, that adds up'
- 'which is the picture of a real, if small, overfill' -> 'a small but real overfill'
- 'the result is not an artifact of bad data or the wrong method' -> 'the finding
  is not a data glitch or the result of using the wrong method' (plainer for a
  non-statistician reader)
Recommendation, numbers, and figures unchanged.
</commit_message>
<xml_diff>
--- a/reports/capstone-1-coffee-fill-weight.docx
+++ b/reports/capstone-1-coffee-fill-weight.docx
@@ -36,7 +36,7 @@
     </w:p>
     <w:p>
       <w:r>
-        <w:t>Lower the fill target from its current setting to about 340.5 grams. Our sample shows bags are averaging a little over a gram above the 340 g label. That is money left on the table at volume, and trimming the target recovers most of it while keeping every bag safely above the printed weight. Do not aim straight at 340 g: that would put roughly half of bags under the label, which the net-content rules do not allow.</w:t>
+        <w:t>Lower the fill target from its current setting to about 340.5 grams. Our sample shows bags are averaging a little over a gram above the 340 g label. At the volumes we run, that adds up, and trimming the target recovers most of it while keeping every bag safely above the printed weight. Do not aim straight at 340 g: that would put roughly half of bags under the label, which the net-content rules do not allow.</w:t>
       </w:r>
     </w:p>
     <w:p>
@@ -104,7 +104,7 @@
           <w:color w:val="64748B"/>
           <w:sz w:val="18"/>
         </w:rPr>
-        <w:t>Every bag we weighed, with the 340 g label (dashed red) and the range where the true average lives (gold band). The band sits completely to the right of the label, which is the picture of a real, if small, overfill.</w:t>
+        <w:t>Every bag we weighed, with the 340 g label (dashed red) and the range where the true average lives (gold band). The band sits completely to the right of the label: a small but real overfill.</w:t>
       </w:r>
     </w:p>
     <w:p>
@@ -136,7 +136,7 @@
     </w:p>
     <w:p>
       <w:r>
-        <w:t>The raw QC export was messy, and we cleaned it before drawing any conclusion. Three duplicate log entries, three blank readings, and three impossible values (a 0-gram empty pan, a mistyped 34.1, and a fat-finger 3410) were removed, taking 78 rows down to 70 genuine measurements. We also confirmed the weights follow the normal bell shape a t-test expects, so the standard test applies, and a second, assumption-free test agreed with it. In short, the result is not an artifact of bad data or the wrong method.</w:t>
+        <w:t>The raw QC export was messy, and we cleaned it before drawing any conclusion. Three duplicate log entries, three blank readings, and three impossible values (a 0-gram empty pan, a mistyped 34.1, and a fat-finger 3410) were removed, taking 78 rows down to 70 genuine measurements. We also confirmed the weights follow the normal bell shape a t-test expects, so the standard test applies, and a second test that makes no such assumption agreed with it. In short, the finding is not a data glitch or the result of using the wrong method.</w:t>
       </w:r>
     </w:p>
     <w:p>

</xml_diff>